<commit_message>
feat: implement job role template system with CSV import/export
- Refactored RoleDescriptionsSettings into an accordion UI with validation and unsaved change tracking
- Added CSV import/export functionality for bulk managing job templates with safety warnings
- Added a 'Contract Responsibility Template' dropdown to the JobHistoryManager
- Updated documentGenerator.js to inject responsibilities based on the explicitly selected template
- Updated Word document templates to align with new data structures
</commit_message>
<xml_diff>
--- a/public/templates/Addendum_Promotion_General.docx
+++ b/public/templates/Addendum_Promotion_General.docx
@@ -28,7 +28,6 @@
         </w:rPr>
         <w:br/>
       </w:r>
-      <w:proofErr w:type="spellStart"/>
       <w:r>
         <w:rPr>
           <w:rFonts w:ascii="Browallia New" w:eastAsia="Aptos" w:hAnsi="Browallia New" w:cs="Browallia New" w:hint="cs"/>
@@ -38,7 +37,6 @@
         </w:rPr>
         <w:t>บันทึกข้อตกลงแก้ไขเพิ่มเติมสัญญาจ้างงาน</w:t>
       </w:r>
-      <w:proofErr w:type="spellEnd"/>
       <w:r>
         <w:rPr>
           <w:rFonts w:ascii="Browallia New" w:eastAsia="Aptos" w:hAnsi="Browallia New" w:cs="Browallia New"/>
@@ -48,7 +46,6 @@
         </w:rPr>
         <w:t xml:space="preserve">: </w:t>
       </w:r>
-      <w:proofErr w:type="spellStart"/>
       <w:r>
         <w:rPr>
           <w:rFonts w:ascii="Browallia New" w:eastAsia="Aptos" w:hAnsi="Browallia New" w:cs="Browallia New" w:hint="cs"/>
@@ -58,7 +55,6 @@
         </w:rPr>
         <w:t>การเลื่อนตำแหน่ง</w:t>
       </w:r>
-      <w:proofErr w:type="spellEnd"/>
     </w:p>
     <w:p>
       <w:pPr>
@@ -95,7 +91,6 @@
         </w:rPr>
         <w:t xml:space="preserve">Date / </w:t>
       </w:r>
-      <w:proofErr w:type="spellStart"/>
       <w:r>
         <w:rPr>
           <w:rFonts w:ascii="Browallia New" w:eastAsia="Aptos" w:hAnsi="Browallia New" w:cs="Browallia New"/>
@@ -106,7 +101,6 @@
         </w:rPr>
         <w:t>วันที่</w:t>
       </w:r>
-      <w:proofErr w:type="spellEnd"/>
       <w:r>
         <w:rPr>
           <w:rFonts w:ascii="Aptos" w:eastAsia="Aptos" w:hAnsi="Aptos" w:cs="Aptos"/>
@@ -138,7 +132,6 @@
         </w:rPr>
         <w:t xml:space="preserve">Employee Name / </w:t>
       </w:r>
-      <w:proofErr w:type="spellStart"/>
       <w:r>
         <w:rPr>
           <w:rFonts w:ascii="Browallia New" w:eastAsia="Aptos" w:hAnsi="Browallia New" w:cs="Browallia New"/>
@@ -149,7 +142,6 @@
         </w:rPr>
         <w:t>ชื่อพนักงาน</w:t>
       </w:r>
-      <w:proofErr w:type="spellEnd"/>
       <w:r>
         <w:rPr>
           <w:rFonts w:ascii="Aptos" w:eastAsia="Aptos" w:hAnsi="Aptos" w:cs="Aptos"/>
@@ -194,54 +186,40 @@
           <w:sz w:val="24"/>
           <w:szCs w:val="24"/>
         </w:rPr>
-        <w:t>บันทึกฉบับนี้ถือเป็นส่วนหนึ่งของสัญญาจ้างงานที่เริ่มต้น</w:t>
-      </w:r>
-      <w:proofErr w:type="spellStart"/>
+        <w:t>บันทึกฉบับนี้ถือเป็นส่วนหนึ่งของสัญญาจ้างงานที่เริ่มต้นเมื่อวันที่</w:t>
+      </w:r>
+      <w:r>
+        <w:rPr>
+          <w:rFonts w:ascii="Aptos" w:eastAsia="Aptos" w:hAnsi="Aptos" w:cs="Aptos"/>
+          <w:sz w:val="24"/>
+          <w:szCs w:val="24"/>
+        </w:rPr>
+        <w:t xml:space="preserve">{{ORIGINAL_START_DATE}} </w:t>
+      </w:r>
       <w:r>
         <w:rPr>
           <w:rFonts w:ascii="Browallia New" w:eastAsia="Aptos" w:hAnsi="Browallia New" w:cs="Browallia New"/>
           <w:sz w:val="24"/>
           <w:szCs w:val="24"/>
         </w:rPr>
-        <w:t>เมื่อวันที่</w:t>
-      </w:r>
-      <w:proofErr w:type="spellEnd"/>
+        <w:t>โดยทั้งสองฝ่ายตกลงแก้ไขเพิ่มเติมดังนี้</w:t>
+      </w:r>
       <w:r>
         <w:rPr>
           <w:rFonts w:ascii="Aptos" w:eastAsia="Aptos" w:hAnsi="Aptos" w:cs="Aptos"/>
           <w:sz w:val="24"/>
           <w:szCs w:val="24"/>
         </w:rPr>
-        <w:t xml:space="preserve">{{ORIGINAL_START_DATE}} </w:t>
-      </w:r>
-      <w:proofErr w:type="spellStart"/>
+        <w:t xml:space="preserve"> </w:t>
+      </w:r>
       <w:r>
         <w:rPr>
           <w:rFonts w:ascii="Browallia New" w:eastAsia="Aptos" w:hAnsi="Browallia New" w:cs="Browallia New"/>
           <w:sz w:val="24"/>
           <w:szCs w:val="24"/>
         </w:rPr>
-        <w:t>โดยทั้งสองฝ่ายตกลงแก้ไขเพิ่มเติมดังนี้</w:t>
-      </w:r>
-      <w:proofErr w:type="spellEnd"/>
-      <w:r>
-        <w:rPr>
-          <w:rFonts w:ascii="Aptos" w:eastAsia="Aptos" w:hAnsi="Aptos" w:cs="Aptos"/>
-          <w:sz w:val="24"/>
-          <w:szCs w:val="24"/>
-        </w:rPr>
-        <w:t xml:space="preserve"> </w:t>
-      </w:r>
-      <w:proofErr w:type="spellStart"/>
-      <w:r>
-        <w:rPr>
-          <w:rFonts w:ascii="Browallia New" w:eastAsia="Aptos" w:hAnsi="Browallia New" w:cs="Browallia New"/>
-          <w:sz w:val="24"/>
-          <w:szCs w:val="24"/>
-        </w:rPr>
         <w:t>ซึ่งมีผลบังคับใช้ตั้งแต่วันที่</w:t>
       </w:r>
-      <w:proofErr w:type="spellEnd"/>
       <w:r>
         <w:rPr>
           <w:rFonts w:ascii="Aptos" w:eastAsia="Aptos" w:hAnsi="Aptos" w:cs="Aptos"/>
@@ -272,7 +250,6 @@
         </w:rPr>
         <w:t xml:space="preserve">1. Job Title &amp; Scope / </w:t>
       </w:r>
-      <w:proofErr w:type="spellStart"/>
       <w:r>
         <w:rPr>
           <w:rFonts w:ascii="Browallia New" w:eastAsia="Aptos" w:hAnsi="Browallia New" w:cs="Browallia New"/>
@@ -283,7 +260,6 @@
         </w:rPr>
         <w:t>ตำแหน่งงานและขอบเขตหน้าที่</w:t>
       </w:r>
-      <w:proofErr w:type="spellEnd"/>
       <w:r>
         <w:rPr>
           <w:rFonts w:ascii="Aptos" w:eastAsia="Aptos" w:hAnsi="Aptos" w:cs="Aptos"/>
@@ -322,7 +298,6 @@
           <w:szCs w:val="24"/>
         </w:rPr>
       </w:pPr>
-      <w:proofErr w:type="spellStart"/>
       <w:r>
         <w:rPr>
           <w:rFonts w:ascii="Browallia New" w:eastAsia="Aptos" w:hAnsi="Browallia New" w:cs="Browallia New"/>
@@ -331,7 +306,6 @@
         </w:rPr>
         <w:t>พนักงานได้รับการเลื่อนตำแหน่งเป็น</w:t>
       </w:r>
-      <w:proofErr w:type="spellEnd"/>
       <w:r>
         <w:rPr>
           <w:rFonts w:ascii="Aptos" w:eastAsia="Aptos" w:hAnsi="Aptos" w:cs="Aptos"/>
@@ -340,7 +314,6 @@
         </w:rPr>
         <w:t xml:space="preserve"> {{NEW_JOB_TITLE}} </w:t>
       </w:r>
-      <w:proofErr w:type="spellStart"/>
       <w:r>
         <w:rPr>
           <w:rFonts w:ascii="Browallia New" w:eastAsia="Aptos" w:hAnsi="Browallia New" w:cs="Browallia New"/>
@@ -349,7 +322,6 @@
         </w:rPr>
         <w:t>ภายในแผนก</w:t>
       </w:r>
-      <w:proofErr w:type="spellEnd"/>
       <w:r>
         <w:rPr>
           <w:rFonts w:ascii="Aptos" w:eastAsia="Aptos" w:hAnsi="Aptos" w:cs="Aptos"/>
@@ -400,7 +372,6 @@
         </w:rPr>
         <w:t xml:space="preserve">Responsibilities / </w:t>
       </w:r>
-      <w:proofErr w:type="spellStart"/>
       <w:r>
         <w:rPr>
           <w:rFonts w:ascii="Browallia New" w:eastAsia="Aptos" w:hAnsi="Browallia New" w:cs="Browallia New"/>
@@ -411,7 +382,6 @@
         </w:rPr>
         <w:t>ความรับผิดชอบ</w:t>
       </w:r>
-      <w:proofErr w:type="spellEnd"/>
       <w:r>
         <w:rPr>
           <w:rFonts w:ascii="Aptos" w:eastAsia="Aptos" w:hAnsi="Aptos" w:cs="Aptos"/>
@@ -435,49 +405,9 @@
       <w:r>
         <w:rPr>
           <w:rFonts w:ascii="Aptos" w:eastAsia="Aptos" w:hAnsi="Aptos" w:cs="Aptos"/>
-          <w:sz w:val="24"/>
-          <w:szCs w:val="24"/>
-        </w:rPr>
-        <w:t xml:space="preserve">[ MANAGER TO TYPE RESPONSIBILITIES HERE BEFORE </w:t>
-      </w:r>
-      <w:proofErr w:type="gramStart"/>
-      <w:r>
-        <w:rPr>
-          <w:rFonts w:ascii="Aptos" w:eastAsia="Aptos" w:hAnsi="Aptos" w:cs="Aptos"/>
-          <w:sz w:val="24"/>
-          <w:szCs w:val="24"/>
-        </w:rPr>
-        <w:t>PRINTING ]</w:t>
-      </w:r>
-      <w:proofErr w:type="gramEnd"/>
-      <w:r>
-        <w:rPr>
-          <w:rFonts w:ascii="Aptos" w:eastAsia="Aptos" w:hAnsi="Aptos" w:cs="Aptos"/>
-          <w:sz w:val="24"/>
-          <w:szCs w:val="24"/>
-        </w:rPr>
-        <w:t xml:space="preserve"> [ </w:t>
-      </w:r>
-      <w:proofErr w:type="spellStart"/>
-      <w:proofErr w:type="gramStart"/>
-      <w:r>
-        <w:rPr>
-          <w:rFonts w:ascii="Browallia New" w:eastAsia="Aptos" w:hAnsi="Browallia New" w:cs="Browallia New"/>
-          <w:sz w:val="24"/>
-          <w:szCs w:val="24"/>
-        </w:rPr>
-        <w:t>ผู้จัดการระบุความรับผิดชอบที่นี่ก่อนพิมพ์</w:t>
-      </w:r>
-      <w:proofErr w:type="spellEnd"/>
-      <w:r>
-        <w:rPr>
-          <w:rFonts w:ascii="Aptos" w:eastAsia="Aptos" w:hAnsi="Aptos" w:cs="Aptos"/>
-          <w:sz w:val="24"/>
-          <w:szCs w:val="24"/>
-        </w:rPr>
-        <w:t xml:space="preserve"> ]</w:t>
-      </w:r>
-      <w:proofErr w:type="gramEnd"/>
+        </w:rPr>
+        <w:t>{{ROLE_RESPONSIBILITIES}}</w:t>
+      </w:r>
     </w:p>
     <w:p>
       <w:pPr>
@@ -510,7 +440,6 @@
         </w:rPr>
         <w:t xml:space="preserve">Compensation / </w:t>
       </w:r>
-      <w:proofErr w:type="spellStart"/>
       <w:r>
         <w:rPr>
           <w:rFonts w:ascii="Browallia New" w:eastAsia="Aptos" w:hAnsi="Browallia New" w:cs="Browallia New"/>
@@ -521,7 +450,6 @@
         </w:rPr>
         <w:t>ค่าจ้าง</w:t>
       </w:r>
-      <w:proofErr w:type="spellEnd"/>
       <w:r>
         <w:rPr>
           <w:rFonts w:ascii="Aptos" w:eastAsia="Aptos" w:hAnsi="Aptos" w:cs="Aptos"/>
@@ -560,7 +488,6 @@
           <w:szCs w:val="24"/>
         </w:rPr>
       </w:pPr>
-      <w:proofErr w:type="spellStart"/>
       <w:r>
         <w:rPr>
           <w:rFonts w:ascii="Browallia New" w:eastAsia="Aptos" w:hAnsi="Browallia New" w:cs="Browallia New"/>
@@ -569,7 +496,6 @@
         </w:rPr>
         <w:t>ค่าจ้างใหม่ของพนักงานคือ</w:t>
       </w:r>
-      <w:proofErr w:type="spellEnd"/>
       <w:r>
         <w:rPr>
           <w:rFonts w:ascii="Aptos" w:eastAsia="Aptos" w:hAnsi="Aptos" w:cs="Aptos"/>
@@ -578,7 +504,6 @@
         </w:rPr>
         <w:t xml:space="preserve"> {{NEW_SALARY_TH}} ({{NEW_SALARY}}) </w:t>
       </w:r>
-      <w:proofErr w:type="spellStart"/>
       <w:r>
         <w:rPr>
           <w:rFonts w:ascii="Browallia New" w:eastAsia="Aptos" w:hAnsi="Browallia New" w:cs="Browallia New"/>
@@ -587,7 +512,6 @@
         </w:rPr>
         <w:t>บาทต่อเดือน</w:t>
       </w:r>
-      <w:proofErr w:type="spellEnd"/>
       <w:r>
         <w:rPr>
           <w:rFonts w:ascii="Aptos" w:eastAsia="Aptos" w:hAnsi="Aptos" w:cs="Aptos"/>
@@ -596,7 +520,6 @@
         </w:rPr>
         <w:t xml:space="preserve"> </w:t>
       </w:r>
-      <w:proofErr w:type="spellStart"/>
       <w:r>
         <w:rPr>
           <w:rFonts w:ascii="Browallia New" w:eastAsia="Aptos" w:hAnsi="Browallia New" w:cs="Browallia New"/>
@@ -605,7 +528,6 @@
         </w:rPr>
         <w:t>ส่วนสวัสดิการอื่นๆ</w:t>
       </w:r>
-      <w:proofErr w:type="spellEnd"/>
       <w:r>
         <w:rPr>
           <w:rFonts w:ascii="Aptos" w:eastAsia="Aptos" w:hAnsi="Aptos" w:cs="Aptos"/>
@@ -614,7 +536,6 @@
         </w:rPr>
         <w:t xml:space="preserve"> </w:t>
       </w:r>
-      <w:proofErr w:type="spellStart"/>
       <w:r>
         <w:rPr>
           <w:rFonts w:ascii="Browallia New" w:eastAsia="Aptos" w:hAnsi="Browallia New" w:cs="Browallia New"/>
@@ -623,7 +544,6 @@
         </w:rPr>
         <w:t>ยังคงเดิม</w:t>
       </w:r>
-      <w:proofErr w:type="spellEnd"/>
     </w:p>
     <w:p>
       <w:pPr>
@@ -659,7 +579,6 @@
         </w:rPr>
         <w:br/>
       </w:r>
-      <w:proofErr w:type="spellStart"/>
       <w:r>
         <w:rPr>
           <w:rFonts w:ascii="Aptos" w:eastAsia="Aptos" w:hAnsi="Aptos" w:cs="Aptos"/>
@@ -667,9 +586,33 @@
           <w:bCs/>
           <w:color w:val="1B1C1D"/>
         </w:rPr>
-        <w:t>Employee</w:t>
-      </w:r>
-      <w:proofErr w:type="spellEnd"/>
+        <w:t>Employee Name:</w:t>
+      </w:r>
+      <w:r>
+        <w:rPr>
+          <w:rFonts w:ascii="Aptos" w:eastAsia="Aptos" w:hAnsi="Aptos" w:cs="Aptos"/>
+          <w:color w:val="1B1C1D"/>
+        </w:rPr>
+        <w:t xml:space="preserve"> </w:t>
+      </w:r>
+      <w:r>
+        <w:rPr>
+          <w:rFonts w:ascii="Aptos" w:eastAsia="Aptos" w:hAnsi="Aptos" w:cs="Aptos"/>
+        </w:rPr>
+        <w:t>{{STAFF_NAME}}</w:t>
+      </w:r>
+      <w:r>
+        <w:rPr>
+          <w:rFonts w:ascii="Aptos" w:eastAsia="Aptos" w:hAnsi="Aptos" w:cs="Aptos"/>
+        </w:rPr>
+        <w:tab/>
+      </w:r>
+      <w:r>
+        <w:rPr>
+          <w:rFonts w:ascii="Aptos" w:eastAsia="Aptos" w:hAnsi="Aptos" w:cs="Aptos"/>
+        </w:rPr>
+        <w:br/>
+      </w:r>
       <w:r>
         <w:rPr>
           <w:rFonts w:ascii="Aptos" w:eastAsia="Aptos" w:hAnsi="Aptos" w:cs="Aptos"/>
@@ -677,32 +620,7 @@
           <w:bCs/>
           <w:color w:val="1B1C1D"/>
         </w:rPr>
-        <w:t xml:space="preserve"> Name:</w:t>
-      </w:r>
-      <w:r>
-        <w:rPr>
-          <w:rFonts w:ascii="Aptos" w:eastAsia="Aptos" w:hAnsi="Aptos" w:cs="Aptos"/>
-          <w:color w:val="1B1C1D"/>
-        </w:rPr>
-        <w:t xml:space="preserve"> </w:t>
-      </w:r>
-      <w:r>
-        <w:rPr>
-          <w:rFonts w:ascii="Aptos" w:eastAsia="Aptos" w:hAnsi="Aptos" w:cs="Aptos"/>
-        </w:rPr>
-        <w:t>{{STAFF_NAME}}</w:t>
-      </w:r>
-      <w:r>
-        <w:rPr>
-          <w:rFonts w:ascii="Aptos" w:eastAsia="Aptos" w:hAnsi="Aptos" w:cs="Aptos"/>
-        </w:rPr>
-        <w:tab/>
-      </w:r>
-      <w:r>
-        <w:rPr>
-          <w:rFonts w:ascii="Aptos" w:eastAsia="Aptos" w:hAnsi="Aptos" w:cs="Aptos"/>
-        </w:rPr>
-        <w:br/>
+        <w:t>Employee Signature</w:t>
       </w:r>
       <w:r>
         <w:rPr>
@@ -711,7 +629,19 @@
           <w:bCs/>
           <w:color w:val="1B1C1D"/>
         </w:rPr>
-        <w:t>Employee Signature</w:t>
+        <w:t>:</w:t>
+      </w:r>
+      <w:r>
+        <w:t xml:space="preserve"> </w:t>
+      </w:r>
+      <w:r>
+        <w:br/>
+      </w:r>
+      <w:r>
+        <w:br/>
+      </w:r>
+      <w:r>
+        <w:br/>
       </w:r>
       <w:r>
         <w:rPr>
@@ -720,19 +650,7 @@
           <w:bCs/>
           <w:color w:val="1B1C1D"/>
         </w:rPr>
-        <w:t>:</w:t>
-      </w:r>
-      <w:r>
-        <w:t xml:space="preserve"> </w:t>
-      </w:r>
-      <w:r>
-        <w:br/>
-      </w:r>
-      <w:r>
-        <w:br/>
-      </w:r>
-      <w:r>
-        <w:br/>
+        <w:t xml:space="preserve">Employer </w:t>
       </w:r>
       <w:r>
         <w:rPr>
@@ -741,7 +659,7 @@
           <w:bCs/>
           <w:color w:val="1B1C1D"/>
         </w:rPr>
-        <w:t xml:space="preserve">Employer </w:t>
+        <w:t>(</w:t>
       </w:r>
       <w:r>
         <w:rPr>
@@ -750,7 +668,7 @@
           <w:bCs/>
           <w:color w:val="1B1C1D"/>
         </w:rPr>
-        <w:t>(</w:t>
+        <w:t>{{COMPANY_LEGAL_NAME}}</w:t>
       </w:r>
       <w:r>
         <w:rPr>
@@ -759,7 +677,7 @@
           <w:bCs/>
           <w:color w:val="1B1C1D"/>
         </w:rPr>
-        <w:t>{{COMPANY_LEGAL_NAME}}</w:t>
+        <w:t>)</w:t>
       </w:r>
       <w:r>
         <w:rPr>
@@ -768,7 +686,7 @@
           <w:bCs/>
           <w:color w:val="1B1C1D"/>
         </w:rPr>
-        <w:t>)</w:t>
+        <w:t xml:space="preserve">, </w:t>
       </w:r>
       <w:r>
         <w:rPr>
@@ -777,7 +695,7 @@
           <w:bCs/>
           <w:color w:val="1B1C1D"/>
         </w:rPr>
-        <w:t xml:space="preserve">, </w:t>
+        <w:t>Represented by:</w:t>
       </w:r>
       <w:r>
         <w:rPr>
@@ -786,7 +704,7 @@
           <w:bCs/>
           <w:color w:val="1B1C1D"/>
         </w:rPr>
-        <w:t>Represented by:</w:t>
+        <w:br/>
       </w:r>
       <w:r>
         <w:rPr>
@@ -795,7 +713,7 @@
           <w:bCs/>
           <w:color w:val="1B1C1D"/>
         </w:rPr>
-        <w:br/>
+        <w:t>{{#DIRECTORS}}</w:t>
       </w:r>
       <w:r>
         <w:rPr>
@@ -804,7 +722,7 @@
           <w:bCs/>
           <w:color w:val="1B1C1D"/>
         </w:rPr>
-        <w:t>{{#DIRECTORS}}</w:t>
+        <w:br/>
       </w:r>
       <w:r>
         <w:rPr>
@@ -813,7 +731,14 @@
           <w:bCs/>
           <w:color w:val="1B1C1D"/>
         </w:rPr>
-        <w:br/>
+        <w:t xml:space="preserve">Director Name: </w:t>
+      </w:r>
+      <w:r>
+        <w:rPr>
+          <w:rFonts w:ascii="Aptos" w:eastAsia="Aptos" w:hAnsi="Aptos" w:cs="Aptos"/>
+          <w:color w:val="1B1C1D"/>
+        </w:rPr>
+        <w:t>{{NAME}}</w:t>
       </w:r>
       <w:r>
         <w:rPr>
@@ -822,14 +747,7 @@
           <w:bCs/>
           <w:color w:val="1B1C1D"/>
         </w:rPr>
-        <w:t xml:space="preserve">Director Name: </w:t>
-      </w:r>
-      <w:r>
-        <w:rPr>
-          <w:rFonts w:ascii="Aptos" w:eastAsia="Aptos" w:hAnsi="Aptos" w:cs="Aptos"/>
-          <w:color w:val="1B1C1D"/>
-        </w:rPr>
-        <w:t>{{NAME}}</w:t>
+        <w:br/>
       </w:r>
       <w:r>
         <w:rPr>
@@ -838,6 +756,15 @@
           <w:bCs/>
           <w:color w:val="1B1C1D"/>
         </w:rPr>
+        <w:t>Director Signature:</w:t>
+      </w:r>
+      <w:r>
+        <w:t xml:space="preserve"> </w:t>
+      </w:r>
+      <w:r>
+        <w:br/>
+      </w:r>
+      <w:r>
         <w:br/>
       </w:r>
       <w:r>
@@ -847,25 +774,7 @@
           <w:bCs/>
           <w:color w:val="1B1C1D"/>
         </w:rPr>
-        <w:t>Director Signature:</w:t>
-      </w:r>
-      <w:r>
-        <w:t xml:space="preserve"> </w:t>
-      </w:r>
-      <w:r>
-        <w:br/>
-      </w:r>
-      <w:r>
         <w:lastRenderedPageBreak/>
-        <w:br/>
-      </w:r>
-      <w:r>
-        <w:rPr>
-          <w:rFonts w:ascii="Aptos" w:eastAsia="Aptos" w:hAnsi="Aptos" w:cs="Aptos"/>
-          <w:b/>
-          <w:bCs/>
-          <w:color w:val="1B1C1D"/>
-        </w:rPr>
         <w:t>{{/DIRECTORS}}</w:t>
       </w:r>
     </w:p>
@@ -5732,6 +5641,7 @@
   <w:style w:type="character" w:default="1" w:styleId="DefaultParagraphFont">
     <w:name w:val="Default Paragraph Font"/>
     <w:uiPriority w:val="1"/>
+    <w:semiHidden/>
     <w:unhideWhenUsed/>
   </w:style>
   <w:style w:type="table" w:default="1" w:styleId="TableNormal">

</xml_diff>